<commit_message>
Repair BSCR workings workbook package namespaces
</commit_message>
<xml_diff>
--- a/docs/generated/PRA-Jan-2026.docx
+++ b/docs/generated/PRA-Jan-2026.docx
@@ -1037,14 +1037,6 @@
         <w:pStyle w:val="FirstParagraph"/>
       </w:pPr>
       <w:r>
-        <w:t xml:space="preserve">The user-reported Excel corruption is unresolved; the workbook is not required for the CSV calculation and the reference steps below are deferred until it opens correctly.</w:t>
-      </w:r>
-    </w:p>
-    <w:p>
-      <w:pPr>
-        <w:pStyle w:val="BodyText"/>
-      </w:pPr>
-      <w:r>
         <w:rPr>
           <w:rStyle w:val="VerbatimChar"/>
         </w:rPr>
@@ -1728,7 +1720,7 @@
         <w:rPr>
           <w:rStyle w:val="VerbatimChar"/>
         </w:rPr>
-        <w:t xml:space="preserve">c8bb3839827c2d81c289b3c92ccac26e24c48725</w:t>
+        <w:t xml:space="preserve">11829071974c94f7418dbf71c0d0eb21f313595c</w:t>
       </w:r>
       <w:r>
         <w:t xml:space="preserve"> </w:t>
@@ -1803,7 +1795,7 @@
         <w:rPr>
           <w:rStyle w:val="VerbatimChar"/>
         </w:rPr>
-        <w:t xml:space="preserve">414a04e08f5abcce2d63931d44eab4462a37b9e52ff8fe96438028b365869bca</w:t>
+        <w:t xml:space="preserve">de86336b806482e9f020cd39e5ea75cd1e175fb8359822da095a205e70993e50</w:t>
       </w:r>
       <w:r>
         <w:t xml:space="preserve">.</w:t>
@@ -1880,7 +1872,7 @@
               <w:rPr>
                 <w:rStyle w:val="VerbatimChar"/>
               </w:rPr>
-              <w:t xml:space="preserve">5f65cd0680ebbd814fe6306cdb2cbba5072e1b91c29c086a13105abb2a3d3cba</w:t>
+              <w:t xml:space="preserve">0c8493c9e469595e860ea342eaa6fc75a18c01ecd1c11050a794ca4880272ec2</w:t>
             </w:r>
           </w:p>
         </w:tc>

</xml_diff>